<commit_message>
2.6 actualización otra vez
</commit_message>
<xml_diff>
--- a/Fase 2/Evidencias Grupales/2.6_GuiaEstudiante_Fase 2_Informe Final Proyecto APT.docx
+++ b/Fase 2/Evidencias Grupales/2.6_GuiaEstudiante_Fase 2_Informe Final Proyecto APT.docx
@@ -3182,6 +3182,26 @@
                 <w:rtl w:val="0"/>
               </w:rPr>
               <w:t xml:space="preserve">“PetCare_DiagramaBDFase2.png”,</w:t>
+            </w:r>
+          </w:p>
+          <w:p>
+            <w:pPr>
+              <w:numPr>
+                <w:ilvl w:val="0"/>
+                <w:numId w:val="5"/>
+              </w:numPr>
+              <w:spacing w:after="0" w:afterAutospacing="0"/>
+              <w:ind w:left="720" w:hanging="360"/>
+              <w:jc w:val="both"/>
+              <w:rPr>
+                <w:u w:val="none"/>
+              </w:rPr>
+            </w:pPr>
+            <w:r>
+              <w:rPr>
+                <w:rtl w:val="0"/>
+              </w:rPr>
+              <w:t xml:space="preserve">“PetCare_DiagramaClases.png”,</w:t>
             </w:r>
           </w:p>
           <w:p>

</xml_diff>